<commit_message>
Synchronize CSZ 178-hour remote practice
</commit_message>
<xml_diff>
--- a/source/documents/proekty-docx/17-programma-povysheniya-kvalifikacii-178.docx
+++ b/source/documents/proekty-docx/17-programma-povysheniya-kvalifikacii-178.docx
@@ -2188,7 +2188,7 @@
         <w:rPr>
           <w:rFonts w:ascii="Times New Roman" w:hAnsi="Times New Roman" w:eastAsia="Times New Roman"/>
         </w:rPr>
-        <w:t xml:space="preserve">5. В каждом модуле 2 академических часа отведены на дистанционную самостоятельную практико-ориентированную работу (практические занятия по учебному плану). Слушатель анализирует учебные документы, схемы и журналы, выполняет расчеты и оформляет письменное решение в ЭИОС. Выезд, работа в учебных помещениях организации и физические манипуляции с оборудованием не предусмотрены. Практические учебные результаты сохраняются и оцениваются преподавателем; просмотр материала и тест сами по себе их не заменяют.</w:t>
+        <w:t xml:space="preserve">5. Практические занятия имеют общий объем 22 академических часа. В модулях 1–7 и 9–11 выполняются десять дистанционных самостоятельных документарных ситуационных заданий по 2 академических часа. В модуле 8 проводится отдельное синхронное дистанционное практическое занятие продолжительностью 2 академических часа: в реальном времени организуются наблюдение объекта с установленным противопожарным занавесом (занавесами), вопросы преподавателю или представителю объекта и оформление отчета в ЭИОС. Выезд слушателя и физические действия слушателя на оборудовании не предусмотрены. Каждый практический результат сохраняется в ЭИОС и оценивается преподавателем.</w:t>
       </w:r>
     </w:p>
     <w:p>
@@ -6462,7 +6462,7 @@
         <w:rPr>
           <w:rFonts w:ascii="Times New Roman" w:hAnsi="Times New Roman" w:eastAsia="Times New Roman"/>
         </w:rPr>
-        <w:t>18. Учебные материалы, задания, контрольные мероприятия и взаимодействие с преподавателем доступны через ЭИОС. Практические занятия проводятся в форме документарных ситуационных задач с загрузкой ответа в ЭИОС.</w:t>
+        <w:t xml:space="preserve">18. Учебные материалы, задания, контрольные мероприятия и взаимодействие с преподавателем доступны через ЭИОС. В модулях 1–7 и 9–11 практические занятия проводятся в форме самостоятельных документарных ситуационных заданий; в модуле 8 — в форме синхронного дистанционного наблюдения реального объекта с установленным противопожарным занавесом (занавесами). Письменные результаты загружаются в ЭИОС.</w:t>
       </w:r>
     </w:p>
     <w:p>
@@ -7558,7 +7558,7 @@
         <w:rPr>
           <w:rFonts w:ascii="Times New Roman" w:hAnsi="Times New Roman" w:eastAsia="Times New Roman"/>
         </w:rPr>
-        <w:t xml:space="preserve">Дистанционное документированное наблюдение работы противопожарного занавеса по видеодемонстрации и технической документации: состав узлов, состояния полотна, аппаратура управления, обратная связь и защитные блокировки. Слушатель фиксирует источник, фрагмент или раздел, наблюдение и границы вывода, затем выполняет письменный анализ учебного технического досье. Учебные данные моделируют производственные условия по пункту 34 приложения № 3 к приказу МЧС России № 1156; очные работы, выезд и физические действия на оборудовании слушателем не выполняются. Содержание темы соотносится с пунктом 24 приложения № 3; описание учебного формата не удостоверяет посещение реального объекта.</w:t>
+        <w:t xml:space="preserve">Посещение объекта с установленным противопожарным занавесом (занавесами) проводится дистанционно в синхронном формате по расписанию. Преподаватель или представитель объекта в реальном времени показывает состав узлов, состояние полотна, аппаратуру управления, обратную связь и защитные блокировки; слушатель фиксирует наблюдения, задает вопросы и оформляет отчет. До занятия фиксируются наименование и адрес объекта, основание его показа, ответственное лицо, дата, время и ссылка доступа; после занятия — участие слушателя и результат оценивания. Выезд слушателя и физические действия слушателя на оборудовании не предусмотрены.</w:t>
       </w:r>
     </w:p>
     <w:p>
@@ -8926,7 +8926,7 @@
           <w:rFonts w:ascii="Times New Roman" w:hAnsi="Times New Roman" w:eastAsia="Times New Roman"/>
           <w:sz w:val="20"/>
         </w:rPr>
-        <w:t xml:space="preserve">38. Промежуточный тест каждого модуля содержит 5 вопросов с одним правильным ответом: зачет — не менее 4 правильных ответов (не менее 70% с округлением количества правильных ответов вверх). Дистанционная самостоятельная работа каждого модуля оценивается отдельно преподавателем. К итоговой аттестации допускается слушатель, получивший зачет по всем 11 модульным тестам и положительную оценку всех 11 самостоятельных работ.</w:t>
+        <w:t xml:space="preserve">38. Промежуточный тест каждого модуля содержит 5 вопросов с одним правильным ответом: зачет — не менее 4 правильных ответов (не менее 70% с округлением количества правильных ответов вверх). Практический результат каждого модуля оценивается отдельно преподавателем: в модулях 1–7 и 9–11 — по самостоятельной работе, в модуле 8 — по участию в синхронном дистанционном занятии и отчету. К итоговой аттестации допускается слушатель, получивший зачет по всем 11 модульным тестам и положительную оценку всех 11 практических результатов.</w:t>
       </w:r>
     </w:p>
     <w:p>
@@ -9046,7 +9046,7 @@
                 <w:rFonts w:ascii="Times New Roman" w:hAnsi="Times New Roman" w:eastAsia="Times New Roman"/>
                 <w:sz w:val="21"/>
               </w:rPr>
-              <w:t>11 практических занятий × 2 академических часа = 22 академических часа. Каждое занятие представляет документарный ситуационный кейс; слушатель загружает обоснованный ответ в ЭИОС.</w:t>
+              <w:t xml:space="preserve">22 академических часа: 20 часов самостоятельных документарных ситуационных заданий по модулям 1–7 и 9–11 и 2 часа синхронного дистанционного наблюдения реального объекта по модулю 8. Слушатель загружает письменные результаты и отчет в ЭИОС.</w:t>
             </w:r>
           </w:p>
         </w:tc>
@@ -11062,14 +11062,13 @@
               <w:spacing w:after="0" w:line="240" w:lineRule="auto"/>
               <w:keepNext/>
             </w:pPr>
-            <w:r/>
             <w:r>
               <w:rPr>
                 <w:rFonts w:ascii="Times New Roman" w:hAnsi="Times New Roman" w:eastAsia="Times New Roman"/>
                 <w:b w:val="0"/>
                 <w:sz w:val="18"/>
               </w:rPr>
-              <w:t xml:space="preserve">По видеодемонстрации, схеме и техническому описанию зафиксировать наблюдения с указанием источника; определить узлы, аппаратуру управления, защитные блокировки и порядок проверки; отделить наблюдаемое состояние от неподтвержденных предположений.</w:t>
+              <w:t xml:space="preserve">Во время синхронного дистанционного наблюдения реального объекта зафиксировать показанные узлы, аппаратуру управления, обратную связь и защитные блокировки; задать уточняющие вопросы; отделить наблюдаемое состояние от неподтвержденных предположений и оформить отчет.</w:t>
             </w:r>
           </w:p>
         </w:tc>
@@ -13017,7 +13016,7 @@
         <w:rPr>
           <w:sz w:val="22"/>
         </w:rPr>
-        <w:t xml:space="preserve">Модуль 3 · тема 4.2. Монтаж, техническое обслуживание и ремонт систем пожарной и охранно- пожарной сигнализации и их элементов, включая диспетчеризацию и проведение пусконаладочных работ.</w:t>
+        <w:t xml:space="preserve">Модуль 3 · тема 4.2. Монтаж, техническое обслуживание и ремонт систем пожарной и охранно-пожарной сигнализации и их элементов, включая диспетчеризацию и проведение пусконаладочных работ.</w:t>
       </w:r>
     </w:p>
     <w:p>
@@ -13150,7 +13149,7 @@
         <w:rPr>
           <w:sz w:val="22"/>
         </w:rPr>
-        <w:t xml:space="preserve">Темы 1.1–3.2 составляют тематическую основу общего модуля 1; темы 4.1–4.10 распределены последовательно по профессиональным модулям 2–11. Все материалы применяются в актуализированной редакции. Номера тем сохраняются для навигации и не обозначают дополнительные часы. В каждом модуле теория и промежуточный тест занимают 14 часов, самостоятельная практико-ориентированная работа — 2 часа. Подробное распределение содержания и материалов приведено в рабочих программах модулей.</w:t>
+        <w:t xml:space="preserve">Темы 1.1–3.2 составляют тематическую основу общего модуля 1; темы 4.1–4.10 распределены последовательно по профессиональным модулям 2–11. Все материалы применяются в актуализированной редакции. Номера тем сохраняются для навигации и не обозначают дополнительные часы. В каждом модуле теория и промежуточный тест занимают 14 часов, практическое занятие — 2 часа: в модулях 1–7 и 9–11 самостоятельно, в модуле 8 синхронно и дистанционно с наблюдением реального объекта. Подробное распределение содержания и материалов приведено в рабочих программах модулей.</w:t>
       </w:r>
     </w:p>
     <w:sectPr>

</xml_diff>

<commit_message>
Use independently audited 178-hour documents
</commit_message>
<xml_diff>
--- a/source/documents/proekty-docx/17-programma-povysheniya-kvalifikacii-178.docx
+++ b/source/documents/proekty-docx/17-programma-povysheniya-kvalifikacii-178.docx
@@ -6404,7 +6404,7 @@
         <w:rPr>
           <w:rFonts w:ascii="Times New Roman" w:hAnsi="Times New Roman" w:eastAsia="Times New Roman"/>
         </w:rPr>
-        <w:t>Обозначение «ИА · 2» — итоговая аттестация продолжительностью 2 академических часа. Перерывы и продолжительность синхронных сессий указываются в расписании и не входят в объем академических часов.</w:t>
+        <w:t xml:space="preserve">Обозначение «ИА · 2» — итоговая аттестация продолжительностью 2 академических часа. Синхронное занятие модуля 8 длится 2 академических часа; время его проведения и перерывы устанавливаются расписанием, при этом перерывы в учебный объем не входят.</w:t>
       </w:r>
     </w:p>
     <w:p>
@@ -11120,14 +11120,13 @@
             <w:pPr>
               <w:spacing w:after="0" w:line="240" w:lineRule="auto"/>
             </w:pPr>
-            <w:r/>
             <w:r>
               <w:rPr>
                 <w:rFonts w:ascii="Times New Roman" w:hAnsi="Times New Roman" w:eastAsia="Times New Roman"/>
                 <w:b w:val="0"/>
                 <w:sz w:val="18"/>
               </w:rPr>
-              <w:t>Документарный ситуационный кейс в ЭИОС по выданным исходным данным, схеме и (или) технической документации.</w:t>
+              <w:t xml:space="preserve">Синхронная видеосвязь по расписанию с преподавателем или представителем реального объекта; ссылка доступа размещается в ЭИОС. Слушатель наблюдает и задает вопросы дистанционно, без управления оборудованием.</w:t>
             </w:r>
           </w:p>
         </w:tc>
@@ -11179,14 +11178,13 @@
             <w:pPr>
               <w:spacing w:after="0" w:line="240" w:lineRule="auto"/>
             </w:pPr>
-            <w:r/>
             <w:r>
               <w:rPr>
                 <w:rFonts w:ascii="Times New Roman" w:hAnsi="Times New Roman" w:eastAsia="Times New Roman"/>
                 <w:b w:val="0"/>
                 <w:sz w:val="18"/>
               </w:rPr>
-              <w:t>Краткое обоснованное решение, загруженное слушателем в ЭИОС.</w:t>
+              <w:t xml:space="preserve">Расписание, сведения об объекте и ответственном лице, журнал участия в синхронном занятии и индивидуальный отчет слушателя, загруженный в ЭИОС.</w:t>
             </w:r>
           </w:p>
         </w:tc>
@@ -11238,14 +11236,13 @@
             <w:pPr>
               <w:spacing w:after="0" w:line="240" w:lineRule="auto"/>
             </w:pPr>
-            <w:r/>
             <w:r>
               <w:rPr>
                 <w:rFonts w:ascii="Times New Roman" w:hAnsi="Times New Roman" w:eastAsia="Times New Roman"/>
                 <w:b w:val="0"/>
                 <w:sz w:val="18"/>
               </w:rPr>
-              <w:t>Обязательные узлы и безопасный порядок проверки определены.</w:t>
+              <w:t xml:space="preserve">Участие подтверждено; объект и источник наблюдения идентифицированы; обязательные узлы и безопасный порядок проверки определены; наблюдения отделены от предположений; ограничения указаны.</w:t>
             </w:r>
           </w:p>
         </w:tc>
@@ -11259,6 +11256,7 @@
     <w:p>
       <w:pPr>
         <w:pStyle w:val="Heading2"/>
+        <w:pageBreakBefore/>
         <w:spacing w:before="200"/>
         <w:keepNext/>
         <w:keepLines/>
@@ -13149,7 +13147,7 @@
         <w:rPr>
           <w:sz w:val="22"/>
         </w:rPr>
-        <w:t xml:space="preserve">Темы 1.1–3.2 составляют тематическую основу общего модуля 1; темы 4.1–4.10 распределены последовательно по профессиональным модулям 2–11. Все материалы применяются в актуализированной редакции. Номера тем сохраняются для навигации и не обозначают дополнительные часы. В каждом модуле теория и промежуточный тест занимают 14 часов, практическое занятие — 2 часа: в модулях 1–7 и 9–11 самостоятельно, в модуле 8 синхронно и дистанционно с наблюдением реального объекта. Подробное распределение содержания и материалов приведено в рабочих программах модулей.</w:t>
+        <w:t xml:space="preserve">Темы 1.1–3.2 образуют общий модуль 1, темы 4.1–4.10 — модули 2–11. Номера тем служат навигации и не добавляют часов. Теория и промежуточный тест каждого модуля занимают 14 часов; практическое занятие — 2 часа: в модулях 1–7 и 9–11 оно выполняется самостоятельно, в модуле 8 проводится синхронно и дистанционно с наблюдением реального объекта. Содержание раскрыто в рабочих программах модулей.</w:t>
       </w:r>
     </w:p>
     <w:sectPr>

</xml_diff>